<commit_message>
[adb-app-status-reboot-api] Bước 4.2: QA Lead sign-off — APPROVED có điều kiện
- 12 Pass / 2 Blocked / 0 Fail, 0 bug P0/P1
- Deploy nội bộ/staging: KHÔNG bị block
- Production: DevOps PHẢI smoke test TC-A01 (app-status foreground) + TC-B01 (reboot) với thiết bị Android thật, ghi bằng chứng vào DEPLOY doc trước go-live

Plan: docs/plans/PLAN-adb-app-status-reboot-api-2026-08-24/steps/STEP-4.2-qa-lead-signoff.md

Co-Authored-By: Claude Fable 5 <noreply@anthropic.com>
</commit_message>
<xml_diff>
--- a/docs/test-cases/TC-adb-app-status-reboot-api.docx
+++ b/docs/test-cases/TC-adb-app-status-reboot-api.docx
@@ -4948,6 +4948,1975 @@
         <w:t>dotnet test: 119/119 Pass</w:t>
       </w:r>
     </w:p>
+    <w:p>
+      <w:pPr>
+        <w:pBdr>
+          <w:bottom w:val="single" w:sz="6" w:space="1" w:color="F05922"/>
+        </w:pBdr>
+        <w:spacing w:after="120"/>
+      </w:pPr>
+    </w:p>
+    <w:p>
+      <w:pPr>
+        <w:pStyle w:val="Heading2"/>
+        <w:spacing w:before="200" w:after="80"/>
+      </w:pPr>
+      <w:r>
+        <w:rPr>
+          <w:color w:val="F05922"/>
+          <w:sz w:val="28"/>
+        </w:rPr>
+        <w:t>QA Lead Sign-off</w:t>
+      </w:r>
+    </w:p>
+    <w:p>
+      <w:pPr>
+        <w:spacing w:after="80"/>
+      </w:pPr>
+      <w:r>
+        <w:rPr>
+          <w:b/>
+          <w:sz w:val="21"/>
+        </w:rPr>
+        <w:t>QA Lead:</w:t>
+      </w:r>
+      <w:r>
+        <w:rPr>
+          <w:sz w:val="21"/>
+        </w:rPr>
+        <w:t xml:space="preserve"> QA Lead (software@kztek.net)</w:t>
+      </w:r>
+    </w:p>
+    <w:p>
+      <w:pPr>
+        <w:spacing w:after="80"/>
+      </w:pPr>
+      <w:r>
+        <w:rPr>
+          <w:b/>
+          <w:sz w:val="21"/>
+        </w:rPr>
+        <w:t>Ngày:</w:t>
+      </w:r>
+      <w:r>
+        <w:rPr>
+          <w:sz w:val="21"/>
+        </w:rPr>
+        <w:t xml:space="preserve"> 2026-08-24</w:t>
+      </w:r>
+    </w:p>
+    <w:p>
+      <w:pPr>
+        <w:pStyle w:val="Heading3"/>
+        <w:spacing w:before="160" w:after="60"/>
+      </w:pPr>
+      <w:r>
+        <w:rPr>
+          <w:color w:val="4A3F8C"/>
+          <w:sz w:val="24"/>
+        </w:rPr>
+        <w:t>Đánh giá coverage</w:t>
+      </w:r>
+    </w:p>
+    <w:p>
+      <w:pPr>
+        <w:spacing w:after="80"/>
+      </w:pPr>
+      <w:r>
+        <w:rPr>
+          <w:b/>
+          <w:sz w:val="21"/>
+        </w:rPr>
+        <w:t>Coverage so với TDD error matrix — ĐỦ:</w:t>
+      </w:r>
+    </w:p>
+    <w:tbl>
+      <w:tblPr>
+        <w:tblStyle w:val="TableGrid"/>
+        <w:tblW w:type="auto" w:w="0"/>
+        <w:tblLook w:firstColumn="1" w:firstRow="1" w:lastColumn="0" w:lastRow="0" w:noHBand="0" w:noVBand="1" w:val="04A0"/>
+      </w:tblPr>
+      <w:tblGrid>
+        <w:gridCol w:w="1938"/>
+        <w:gridCol w:w="1938"/>
+        <w:gridCol w:w="1938"/>
+        <w:gridCol w:w="1938"/>
+        <w:gridCol w:w="1938"/>
+      </w:tblGrid>
+      <w:tr>
+        <w:tc>
+          <w:tcPr>
+            <w:tcW w:type="dxa" w:w="1938"/>
+            <w:shd w:val="clear" w:color="auto" w:fill="251C53"/>
+            <w:tcBorders>
+              <w:top w:val="single" w:sz="4" w:space="0" w:color="251C53"/>
+              <w:left w:val="single" w:sz="4" w:space="0" w:color="251C53"/>
+              <w:bottom w:val="single" w:sz="4" w:space="0" w:color="251C53"/>
+              <w:right w:val="single" w:sz="4" w:space="0" w:color="251C53"/>
+            </w:tcBorders>
+          </w:tcPr>
+          <w:p>
+            <w:r>
+              <w:rPr>
+                <w:b/>
+                <w:color w:val="FFFFFF"/>
+                <w:sz w:val="20"/>
+              </w:rPr>
+              <w:t>API</w:t>
+            </w:r>
+          </w:p>
+        </w:tc>
+        <w:tc>
+          <w:tcPr>
+            <w:tcW w:type="dxa" w:w="1938"/>
+            <w:shd w:val="clear" w:color="auto" w:fill="251C53"/>
+            <w:tcBorders>
+              <w:top w:val="single" w:sz="4" w:space="0" w:color="251C53"/>
+              <w:left w:val="single" w:sz="4" w:space="0" w:color="251C53"/>
+              <w:bottom w:val="single" w:sz="4" w:space="0" w:color="251C53"/>
+              <w:right w:val="single" w:sz="4" w:space="0" w:color="251C53"/>
+            </w:tcBorders>
+          </w:tcPr>
+          <w:p>
+            <w:r>
+              <w:rPr>
+                <w:b/>
+                <w:color w:val="FFFFFF"/>
+                <w:sz w:val="20"/>
+              </w:rPr>
+              <w:t>Status code</w:t>
+            </w:r>
+          </w:p>
+        </w:tc>
+        <w:tc>
+          <w:tcPr>
+            <w:tcW w:type="dxa" w:w="1938"/>
+            <w:shd w:val="clear" w:color="auto" w:fill="251C53"/>
+            <w:tcBorders>
+              <w:top w:val="single" w:sz="4" w:space="0" w:color="251C53"/>
+              <w:left w:val="single" w:sz="4" w:space="0" w:color="251C53"/>
+              <w:bottom w:val="single" w:sz="4" w:space="0" w:color="251C53"/>
+              <w:right w:val="single" w:sz="4" w:space="0" w:color="251C53"/>
+            </w:tcBorders>
+          </w:tcPr>
+          <w:p>
+            <w:r>
+              <w:rPr>
+                <w:b/>
+                <w:color w:val="FFFFFF"/>
+                <w:sz w:val="20"/>
+              </w:rPr>
+              <w:t>TC</w:t>
+            </w:r>
+          </w:p>
+        </w:tc>
+        <w:tc>
+          <w:tcPr>
+            <w:tcW w:type="dxa" w:w="1938"/>
+            <w:shd w:val="clear" w:color="auto" w:fill="251C53"/>
+            <w:tcBorders>
+              <w:top w:val="single" w:sz="4" w:space="0" w:color="251C53"/>
+              <w:left w:val="single" w:sz="4" w:space="0" w:color="251C53"/>
+              <w:bottom w:val="single" w:sz="4" w:space="0" w:color="251C53"/>
+              <w:right w:val="single" w:sz="4" w:space="0" w:color="251C53"/>
+            </w:tcBorders>
+          </w:tcPr>
+          <w:p>
+            <w:r>
+              <w:rPr>
+                <w:b/>
+                <w:color w:val="FFFFFF"/>
+                <w:sz w:val="20"/>
+              </w:rPr>
+              <w:t>Phương pháp</w:t>
+            </w:r>
+          </w:p>
+        </w:tc>
+        <w:tc>
+          <w:tcPr>
+            <w:tcW w:type="dxa" w:w="1938"/>
+            <w:shd w:val="clear" w:color="auto" w:fill="251C53"/>
+            <w:tcBorders>
+              <w:top w:val="single" w:sz="4" w:space="0" w:color="251C53"/>
+              <w:left w:val="single" w:sz="4" w:space="0" w:color="251C53"/>
+              <w:bottom w:val="single" w:sz="4" w:space="0" w:color="251C53"/>
+              <w:right w:val="single" w:sz="4" w:space="0" w:color="251C53"/>
+            </w:tcBorders>
+          </w:tcPr>
+          <w:p>
+            <w:r>
+              <w:rPr>
+                <w:b/>
+                <w:color w:val="FFFFFF"/>
+                <w:sz w:val="20"/>
+              </w:rPr>
+              <w:t>Kết quả</w:t>
+            </w:r>
+          </w:p>
+        </w:tc>
+      </w:tr>
+      <w:tr>
+        <w:tc>
+          <w:tcPr>
+            <w:tcW w:type="dxa" w:w="1938"/>
+            <w:tcBorders>
+              <w:top w:val="single" w:sz="4" w:space="0" w:color="CBCBCB"/>
+              <w:left w:val="single" w:sz="4" w:space="0" w:color="CBCBCB"/>
+              <w:bottom w:val="single" w:sz="4" w:space="0" w:color="CBCBCB"/>
+              <w:right w:val="single" w:sz="4" w:space="0" w:color="CBCBCB"/>
+            </w:tcBorders>
+          </w:tcPr>
+          <w:p>
+            <w:r>
+              <w:rPr>
+                <w:sz w:val="20"/>
+              </w:rPr>
+              <w:t>-----</w:t>
+            </w:r>
+          </w:p>
+        </w:tc>
+        <w:tc>
+          <w:tcPr>
+            <w:tcW w:type="dxa" w:w="1938"/>
+            <w:tcBorders>
+              <w:top w:val="single" w:sz="4" w:space="0" w:color="CBCBCB"/>
+              <w:left w:val="single" w:sz="4" w:space="0" w:color="CBCBCB"/>
+              <w:bottom w:val="single" w:sz="4" w:space="0" w:color="CBCBCB"/>
+              <w:right w:val="single" w:sz="4" w:space="0" w:color="CBCBCB"/>
+            </w:tcBorders>
+          </w:tcPr>
+          <w:p>
+            <w:r>
+              <w:rPr>
+                <w:sz w:val="20"/>
+              </w:rPr>
+              <w:t>------------</w:t>
+            </w:r>
+          </w:p>
+        </w:tc>
+        <w:tc>
+          <w:tcPr>
+            <w:tcW w:type="dxa" w:w="1938"/>
+            <w:tcBorders>
+              <w:top w:val="single" w:sz="4" w:space="0" w:color="CBCBCB"/>
+              <w:left w:val="single" w:sz="4" w:space="0" w:color="CBCBCB"/>
+              <w:bottom w:val="single" w:sz="4" w:space="0" w:color="CBCBCB"/>
+              <w:right w:val="single" w:sz="4" w:space="0" w:color="CBCBCB"/>
+            </w:tcBorders>
+          </w:tcPr>
+          <w:p>
+            <w:r>
+              <w:rPr>
+                <w:sz w:val="20"/>
+              </w:rPr>
+              <w:t>-----</w:t>
+            </w:r>
+          </w:p>
+        </w:tc>
+        <w:tc>
+          <w:tcPr>
+            <w:tcW w:type="dxa" w:w="1938"/>
+            <w:tcBorders>
+              <w:top w:val="single" w:sz="4" w:space="0" w:color="CBCBCB"/>
+              <w:left w:val="single" w:sz="4" w:space="0" w:color="CBCBCB"/>
+              <w:bottom w:val="single" w:sz="4" w:space="0" w:color="CBCBCB"/>
+              <w:right w:val="single" w:sz="4" w:space="0" w:color="CBCBCB"/>
+            </w:tcBorders>
+          </w:tcPr>
+          <w:p>
+            <w:r>
+              <w:rPr>
+                <w:sz w:val="20"/>
+              </w:rPr>
+              <w:t>-------------</w:t>
+            </w:r>
+          </w:p>
+        </w:tc>
+        <w:tc>
+          <w:tcPr>
+            <w:tcW w:type="dxa" w:w="1938"/>
+            <w:tcBorders>
+              <w:top w:val="single" w:sz="4" w:space="0" w:color="CBCBCB"/>
+              <w:left w:val="single" w:sz="4" w:space="0" w:color="CBCBCB"/>
+              <w:bottom w:val="single" w:sz="4" w:space="0" w:color="CBCBCB"/>
+              <w:right w:val="single" w:sz="4" w:space="0" w:color="CBCBCB"/>
+            </w:tcBorders>
+          </w:tcPr>
+          <w:p>
+            <w:r>
+              <w:rPr>
+                <w:sz w:val="20"/>
+              </w:rPr>
+              <w:t>---------</w:t>
+            </w:r>
+          </w:p>
+        </w:tc>
+      </w:tr>
+      <w:tr>
+        <w:tc>
+          <w:tcPr>
+            <w:tcW w:type="dxa" w:w="1938"/>
+            <w:shd w:val="clear" w:color="auto" w:fill="B8B3D6"/>
+            <w:tcBorders>
+              <w:top w:val="single" w:sz="4" w:space="0" w:color="CBCBCB"/>
+              <w:left w:val="single" w:sz="4" w:space="0" w:color="CBCBCB"/>
+              <w:bottom w:val="single" w:sz="4" w:space="0" w:color="CBCBCB"/>
+              <w:right w:val="single" w:sz="4" w:space="0" w:color="CBCBCB"/>
+            </w:tcBorders>
+          </w:tcPr>
+          <w:p>
+            <w:r>
+              <w:rPr>
+                <w:sz w:val="20"/>
+              </w:rPr>
+              <w:t>app-status</w:t>
+            </w:r>
+          </w:p>
+        </w:tc>
+        <w:tc>
+          <w:tcPr>
+            <w:tcW w:type="dxa" w:w="1938"/>
+            <w:shd w:val="clear" w:color="auto" w:fill="B8B3D6"/>
+            <w:tcBorders>
+              <w:top w:val="single" w:sz="4" w:space="0" w:color="CBCBCB"/>
+              <w:left w:val="single" w:sz="4" w:space="0" w:color="CBCBCB"/>
+              <w:bottom w:val="single" w:sz="4" w:space="0" w:color="CBCBCB"/>
+              <w:right w:val="single" w:sz="4" w:space="0" w:color="CBCBCB"/>
+            </w:tcBorders>
+          </w:tcPr>
+          <w:p>
+            <w:r>
+              <w:rPr>
+                <w:sz w:val="20"/>
+              </w:rPr>
+              <w:t>200 (Foreground/Background/NotRunning)</w:t>
+            </w:r>
+          </w:p>
+        </w:tc>
+        <w:tc>
+          <w:tcPr>
+            <w:tcW w:type="dxa" w:w="1938"/>
+            <w:shd w:val="clear" w:color="auto" w:fill="B8B3D6"/>
+            <w:tcBorders>
+              <w:top w:val="single" w:sz="4" w:space="0" w:color="CBCBCB"/>
+              <w:left w:val="single" w:sz="4" w:space="0" w:color="CBCBCB"/>
+              <w:bottom w:val="single" w:sz="4" w:space="0" w:color="CBCBCB"/>
+              <w:right w:val="single" w:sz="4" w:space="0" w:color="CBCBCB"/>
+            </w:tcBorders>
+          </w:tcPr>
+          <w:p>
+            <w:r>
+              <w:rPr>
+                <w:sz w:val="20"/>
+              </w:rPr>
+              <w:t>TC-A01/A02/A03</w:t>
+            </w:r>
+          </w:p>
+        </w:tc>
+        <w:tc>
+          <w:tcPr>
+            <w:tcW w:type="dxa" w:w="1938"/>
+            <w:shd w:val="clear" w:color="auto" w:fill="B8B3D6"/>
+            <w:tcBorders>
+              <w:top w:val="single" w:sz="4" w:space="0" w:color="CBCBCB"/>
+              <w:left w:val="single" w:sz="4" w:space="0" w:color="CBCBCB"/>
+              <w:bottom w:val="single" w:sz="4" w:space="0" w:color="CBCBCB"/>
+              <w:right w:val="single" w:sz="4" w:space="0" w:color="CBCBCB"/>
+            </w:tcBorders>
+          </w:tcPr>
+          <w:p>
+            <w:r>
+              <w:rPr>
+                <w:sz w:val="20"/>
+              </w:rPr>
+              <w:t>Unit test (không có thiết bị)</w:t>
+            </w:r>
+          </w:p>
+        </w:tc>
+        <w:tc>
+          <w:tcPr>
+            <w:tcW w:type="dxa" w:w="1938"/>
+            <w:shd w:val="clear" w:color="auto" w:fill="B8B3D6"/>
+            <w:tcBorders>
+              <w:top w:val="single" w:sz="4" w:space="0" w:color="CBCBCB"/>
+              <w:left w:val="single" w:sz="4" w:space="0" w:color="CBCBCB"/>
+              <w:bottom w:val="single" w:sz="4" w:space="0" w:color="CBCBCB"/>
+              <w:right w:val="single" w:sz="4" w:space="0" w:color="CBCBCB"/>
+            </w:tcBorders>
+          </w:tcPr>
+          <w:p>
+            <w:r>
+              <w:rPr>
+                <w:sz w:val="20"/>
+              </w:rPr>
+              <w:t>Blocked / Pass (unit)</w:t>
+            </w:r>
+          </w:p>
+        </w:tc>
+      </w:tr>
+      <w:tr>
+        <w:tc>
+          <w:tcPr>
+            <w:tcW w:type="dxa" w:w="1938"/>
+            <w:tcBorders>
+              <w:top w:val="single" w:sz="4" w:space="0" w:color="CBCBCB"/>
+              <w:left w:val="single" w:sz="4" w:space="0" w:color="CBCBCB"/>
+              <w:bottom w:val="single" w:sz="4" w:space="0" w:color="CBCBCB"/>
+              <w:right w:val="single" w:sz="4" w:space="0" w:color="CBCBCB"/>
+            </w:tcBorders>
+          </w:tcPr>
+          <w:p>
+            <w:r>
+              <w:rPr>
+                <w:sz w:val="20"/>
+              </w:rPr>
+              <w:t>app-status</w:t>
+            </w:r>
+          </w:p>
+        </w:tc>
+        <w:tc>
+          <w:tcPr>
+            <w:tcW w:type="dxa" w:w="1938"/>
+            <w:tcBorders>
+              <w:top w:val="single" w:sz="4" w:space="0" w:color="CBCBCB"/>
+              <w:left w:val="single" w:sz="4" w:space="0" w:color="CBCBCB"/>
+              <w:bottom w:val="single" w:sz="4" w:space="0" w:color="CBCBCB"/>
+              <w:right w:val="single" w:sz="4" w:space="0" w:color="CBCBCB"/>
+            </w:tcBorders>
+          </w:tcPr>
+          <w:p>
+            <w:r>
+              <w:rPr>
+                <w:sz w:val="20"/>
+              </w:rPr>
+              <w:t>400</w:t>
+            </w:r>
+          </w:p>
+        </w:tc>
+        <w:tc>
+          <w:tcPr>
+            <w:tcW w:type="dxa" w:w="1938"/>
+            <w:tcBorders>
+              <w:top w:val="single" w:sz="4" w:space="0" w:color="CBCBCB"/>
+              <w:left w:val="single" w:sz="4" w:space="0" w:color="CBCBCB"/>
+              <w:bottom w:val="single" w:sz="4" w:space="0" w:color="CBCBCB"/>
+              <w:right w:val="single" w:sz="4" w:space="0" w:color="CBCBCB"/>
+            </w:tcBorders>
+          </w:tcPr>
+          <w:p>
+            <w:r>
+              <w:rPr>
+                <w:sz w:val="20"/>
+              </w:rPr>
+              <w:t>TC-A05</w:t>
+            </w:r>
+          </w:p>
+        </w:tc>
+        <w:tc>
+          <w:tcPr>
+            <w:tcW w:type="dxa" w:w="1938"/>
+            <w:tcBorders>
+              <w:top w:val="single" w:sz="4" w:space="0" w:color="CBCBCB"/>
+              <w:left w:val="single" w:sz="4" w:space="0" w:color="CBCBCB"/>
+              <w:bottom w:val="single" w:sz="4" w:space="0" w:color="CBCBCB"/>
+              <w:right w:val="single" w:sz="4" w:space="0" w:color="CBCBCB"/>
+            </w:tcBorders>
+          </w:tcPr>
+          <w:p>
+            <w:r>
+              <w:rPr>
+                <w:sz w:val="20"/>
+              </w:rPr>
+              <w:t>HTTP thực tế</w:t>
+            </w:r>
+          </w:p>
+        </w:tc>
+        <w:tc>
+          <w:tcPr>
+            <w:tcW w:type="dxa" w:w="1938"/>
+            <w:tcBorders>
+              <w:top w:val="single" w:sz="4" w:space="0" w:color="CBCBCB"/>
+              <w:left w:val="single" w:sz="4" w:space="0" w:color="CBCBCB"/>
+              <w:bottom w:val="single" w:sz="4" w:space="0" w:color="CBCBCB"/>
+              <w:right w:val="single" w:sz="4" w:space="0" w:color="CBCBCB"/>
+            </w:tcBorders>
+          </w:tcPr>
+          <w:p>
+            <w:r>
+              <w:rPr>
+                <w:sz w:val="20"/>
+              </w:rPr>
+              <w:t>PASS</w:t>
+            </w:r>
+          </w:p>
+        </w:tc>
+      </w:tr>
+      <w:tr>
+        <w:tc>
+          <w:tcPr>
+            <w:tcW w:type="dxa" w:w="1938"/>
+            <w:shd w:val="clear" w:color="auto" w:fill="B8B3D6"/>
+            <w:tcBorders>
+              <w:top w:val="single" w:sz="4" w:space="0" w:color="CBCBCB"/>
+              <w:left w:val="single" w:sz="4" w:space="0" w:color="CBCBCB"/>
+              <w:bottom w:val="single" w:sz="4" w:space="0" w:color="CBCBCB"/>
+              <w:right w:val="single" w:sz="4" w:space="0" w:color="CBCBCB"/>
+            </w:tcBorders>
+          </w:tcPr>
+          <w:p>
+            <w:r>
+              <w:rPr>
+                <w:sz w:val="20"/>
+              </w:rPr>
+              <w:t>app-status</w:t>
+            </w:r>
+          </w:p>
+        </w:tc>
+        <w:tc>
+          <w:tcPr>
+            <w:tcW w:type="dxa" w:w="1938"/>
+            <w:shd w:val="clear" w:color="auto" w:fill="B8B3D6"/>
+            <w:tcBorders>
+              <w:top w:val="single" w:sz="4" w:space="0" w:color="CBCBCB"/>
+              <w:left w:val="single" w:sz="4" w:space="0" w:color="CBCBCB"/>
+              <w:bottom w:val="single" w:sz="4" w:space="0" w:color="CBCBCB"/>
+              <w:right w:val="single" w:sz="4" w:space="0" w:color="CBCBCB"/>
+            </w:tcBorders>
+          </w:tcPr>
+          <w:p>
+            <w:r>
+              <w:rPr>
+                <w:sz w:val="20"/>
+              </w:rPr>
+              <w:t>401</w:t>
+            </w:r>
+          </w:p>
+        </w:tc>
+        <w:tc>
+          <w:tcPr>
+            <w:tcW w:type="dxa" w:w="1938"/>
+            <w:shd w:val="clear" w:color="auto" w:fill="B8B3D6"/>
+            <w:tcBorders>
+              <w:top w:val="single" w:sz="4" w:space="0" w:color="CBCBCB"/>
+              <w:left w:val="single" w:sz="4" w:space="0" w:color="CBCBCB"/>
+              <w:bottom w:val="single" w:sz="4" w:space="0" w:color="CBCBCB"/>
+              <w:right w:val="single" w:sz="4" w:space="0" w:color="CBCBCB"/>
+            </w:tcBorders>
+          </w:tcPr>
+          <w:p>
+            <w:r>
+              <w:rPr>
+                <w:sz w:val="20"/>
+              </w:rPr>
+              <w:t>TC-A06</w:t>
+            </w:r>
+          </w:p>
+        </w:tc>
+        <w:tc>
+          <w:tcPr>
+            <w:tcW w:type="dxa" w:w="1938"/>
+            <w:shd w:val="clear" w:color="auto" w:fill="B8B3D6"/>
+            <w:tcBorders>
+              <w:top w:val="single" w:sz="4" w:space="0" w:color="CBCBCB"/>
+              <w:left w:val="single" w:sz="4" w:space="0" w:color="CBCBCB"/>
+              <w:bottom w:val="single" w:sz="4" w:space="0" w:color="CBCBCB"/>
+              <w:right w:val="single" w:sz="4" w:space="0" w:color="CBCBCB"/>
+            </w:tcBorders>
+          </w:tcPr>
+          <w:p>
+            <w:r>
+              <w:rPr>
+                <w:sz w:val="20"/>
+              </w:rPr>
+              <w:t>HTTP thực tế</w:t>
+            </w:r>
+          </w:p>
+        </w:tc>
+        <w:tc>
+          <w:tcPr>
+            <w:tcW w:type="dxa" w:w="1938"/>
+            <w:shd w:val="clear" w:color="auto" w:fill="B8B3D6"/>
+            <w:tcBorders>
+              <w:top w:val="single" w:sz="4" w:space="0" w:color="CBCBCB"/>
+              <w:left w:val="single" w:sz="4" w:space="0" w:color="CBCBCB"/>
+              <w:bottom w:val="single" w:sz="4" w:space="0" w:color="CBCBCB"/>
+              <w:right w:val="single" w:sz="4" w:space="0" w:color="CBCBCB"/>
+            </w:tcBorders>
+          </w:tcPr>
+          <w:p>
+            <w:r>
+              <w:rPr>
+                <w:sz w:val="20"/>
+              </w:rPr>
+              <w:t>PASS</w:t>
+            </w:r>
+          </w:p>
+        </w:tc>
+      </w:tr>
+      <w:tr>
+        <w:tc>
+          <w:tcPr>
+            <w:tcW w:type="dxa" w:w="1938"/>
+            <w:tcBorders>
+              <w:top w:val="single" w:sz="4" w:space="0" w:color="CBCBCB"/>
+              <w:left w:val="single" w:sz="4" w:space="0" w:color="CBCBCB"/>
+              <w:bottom w:val="single" w:sz="4" w:space="0" w:color="CBCBCB"/>
+              <w:right w:val="single" w:sz="4" w:space="0" w:color="CBCBCB"/>
+            </w:tcBorders>
+          </w:tcPr>
+          <w:p>
+            <w:r>
+              <w:rPr>
+                <w:sz w:val="20"/>
+              </w:rPr>
+              <w:t>app-status</w:t>
+            </w:r>
+          </w:p>
+        </w:tc>
+        <w:tc>
+          <w:tcPr>
+            <w:tcW w:type="dxa" w:w="1938"/>
+            <w:tcBorders>
+              <w:top w:val="single" w:sz="4" w:space="0" w:color="CBCBCB"/>
+              <w:left w:val="single" w:sz="4" w:space="0" w:color="CBCBCB"/>
+              <w:bottom w:val="single" w:sz="4" w:space="0" w:color="CBCBCB"/>
+              <w:right w:val="single" w:sz="4" w:space="0" w:color="CBCBCB"/>
+            </w:tcBorders>
+          </w:tcPr>
+          <w:p>
+            <w:r>
+              <w:rPr>
+                <w:sz w:val="20"/>
+              </w:rPr>
+              <w:t>404</w:t>
+            </w:r>
+          </w:p>
+        </w:tc>
+        <w:tc>
+          <w:tcPr>
+            <w:tcW w:type="dxa" w:w="1938"/>
+            <w:tcBorders>
+              <w:top w:val="single" w:sz="4" w:space="0" w:color="CBCBCB"/>
+              <w:left w:val="single" w:sz="4" w:space="0" w:color="CBCBCB"/>
+              <w:bottom w:val="single" w:sz="4" w:space="0" w:color="CBCBCB"/>
+              <w:right w:val="single" w:sz="4" w:space="0" w:color="CBCBCB"/>
+            </w:tcBorders>
+          </w:tcPr>
+          <w:p>
+            <w:r>
+              <w:rPr>
+                <w:sz w:val="20"/>
+              </w:rPr>
+              <w:t>TC-A04</w:t>
+            </w:r>
+          </w:p>
+        </w:tc>
+        <w:tc>
+          <w:tcPr>
+            <w:tcW w:type="dxa" w:w="1938"/>
+            <w:tcBorders>
+              <w:top w:val="single" w:sz="4" w:space="0" w:color="CBCBCB"/>
+              <w:left w:val="single" w:sz="4" w:space="0" w:color="CBCBCB"/>
+              <w:bottom w:val="single" w:sz="4" w:space="0" w:color="CBCBCB"/>
+              <w:right w:val="single" w:sz="4" w:space="0" w:color="CBCBCB"/>
+            </w:tcBorders>
+          </w:tcPr>
+          <w:p>
+            <w:r>
+              <w:rPr>
+                <w:sz w:val="20"/>
+              </w:rPr>
+              <w:t>HTTP thực tế</w:t>
+            </w:r>
+          </w:p>
+        </w:tc>
+        <w:tc>
+          <w:tcPr>
+            <w:tcW w:type="dxa" w:w="1938"/>
+            <w:tcBorders>
+              <w:top w:val="single" w:sz="4" w:space="0" w:color="CBCBCB"/>
+              <w:left w:val="single" w:sz="4" w:space="0" w:color="CBCBCB"/>
+              <w:bottom w:val="single" w:sz="4" w:space="0" w:color="CBCBCB"/>
+              <w:right w:val="single" w:sz="4" w:space="0" w:color="CBCBCB"/>
+            </w:tcBorders>
+          </w:tcPr>
+          <w:p>
+            <w:r>
+              <w:rPr>
+                <w:sz w:val="20"/>
+              </w:rPr>
+              <w:t>PASS</w:t>
+            </w:r>
+          </w:p>
+        </w:tc>
+      </w:tr>
+      <w:tr>
+        <w:tc>
+          <w:tcPr>
+            <w:tcW w:type="dxa" w:w="1938"/>
+            <w:shd w:val="clear" w:color="auto" w:fill="B8B3D6"/>
+            <w:tcBorders>
+              <w:top w:val="single" w:sz="4" w:space="0" w:color="CBCBCB"/>
+              <w:left w:val="single" w:sz="4" w:space="0" w:color="CBCBCB"/>
+              <w:bottom w:val="single" w:sz="4" w:space="0" w:color="CBCBCB"/>
+              <w:right w:val="single" w:sz="4" w:space="0" w:color="CBCBCB"/>
+            </w:tcBorders>
+          </w:tcPr>
+          <w:p>
+            <w:r>
+              <w:rPr>
+                <w:sz w:val="20"/>
+              </w:rPr>
+              <w:t>app-status</w:t>
+            </w:r>
+          </w:p>
+        </w:tc>
+        <w:tc>
+          <w:tcPr>
+            <w:tcW w:type="dxa" w:w="1938"/>
+            <w:shd w:val="clear" w:color="auto" w:fill="B8B3D6"/>
+            <w:tcBorders>
+              <w:top w:val="single" w:sz="4" w:space="0" w:color="CBCBCB"/>
+              <w:left w:val="single" w:sz="4" w:space="0" w:color="CBCBCB"/>
+              <w:bottom w:val="single" w:sz="4" w:space="0" w:color="CBCBCB"/>
+              <w:right w:val="single" w:sz="4" w:space="0" w:color="CBCBCB"/>
+            </w:tcBorders>
+          </w:tcPr>
+          <w:p>
+            <w:r>
+              <w:rPr>
+                <w:sz w:val="20"/>
+              </w:rPr>
+              <w:t>422</w:t>
+            </w:r>
+          </w:p>
+        </w:tc>
+        <w:tc>
+          <w:tcPr>
+            <w:tcW w:type="dxa" w:w="1938"/>
+            <w:shd w:val="clear" w:color="auto" w:fill="B8B3D6"/>
+            <w:tcBorders>
+              <w:top w:val="single" w:sz="4" w:space="0" w:color="CBCBCB"/>
+              <w:left w:val="single" w:sz="4" w:space="0" w:color="CBCBCB"/>
+              <w:bottom w:val="single" w:sz="4" w:space="0" w:color="CBCBCB"/>
+              <w:right w:val="single" w:sz="4" w:space="0" w:color="CBCBCB"/>
+            </w:tcBorders>
+          </w:tcPr>
+          <w:p>
+            <w:r>
+              <w:rPr>
+                <w:sz w:val="20"/>
+              </w:rPr>
+              <w:t>TC-A07</w:t>
+            </w:r>
+          </w:p>
+        </w:tc>
+        <w:tc>
+          <w:tcPr>
+            <w:tcW w:type="dxa" w:w="1938"/>
+            <w:shd w:val="clear" w:color="auto" w:fill="B8B3D6"/>
+            <w:tcBorders>
+              <w:top w:val="single" w:sz="4" w:space="0" w:color="CBCBCB"/>
+              <w:left w:val="single" w:sz="4" w:space="0" w:color="CBCBCB"/>
+              <w:bottom w:val="single" w:sz="4" w:space="0" w:color="CBCBCB"/>
+              <w:right w:val="single" w:sz="4" w:space="0" w:color="CBCBCB"/>
+            </w:tcBorders>
+          </w:tcPr>
+          <w:p>
+            <w:r>
+              <w:rPr>
+                <w:sz w:val="20"/>
+              </w:rPr>
+              <w:t>Unit test</w:t>
+            </w:r>
+          </w:p>
+        </w:tc>
+        <w:tc>
+          <w:tcPr>
+            <w:tcW w:type="dxa" w:w="1938"/>
+            <w:shd w:val="clear" w:color="auto" w:fill="B8B3D6"/>
+            <w:tcBorders>
+              <w:top w:val="single" w:sz="4" w:space="0" w:color="CBCBCB"/>
+              <w:left w:val="single" w:sz="4" w:space="0" w:color="CBCBCB"/>
+              <w:bottom w:val="single" w:sz="4" w:space="0" w:color="CBCBCB"/>
+              <w:right w:val="single" w:sz="4" w:space="0" w:color="CBCBCB"/>
+            </w:tcBorders>
+          </w:tcPr>
+          <w:p>
+            <w:r>
+              <w:rPr>
+                <w:sz w:val="20"/>
+              </w:rPr>
+              <w:t>Pass (unit)</w:t>
+            </w:r>
+          </w:p>
+        </w:tc>
+      </w:tr>
+      <w:tr>
+        <w:tc>
+          <w:tcPr>
+            <w:tcW w:type="dxa" w:w="1938"/>
+            <w:tcBorders>
+              <w:top w:val="single" w:sz="4" w:space="0" w:color="CBCBCB"/>
+              <w:left w:val="single" w:sz="4" w:space="0" w:color="CBCBCB"/>
+              <w:bottom w:val="single" w:sz="4" w:space="0" w:color="CBCBCB"/>
+              <w:right w:val="single" w:sz="4" w:space="0" w:color="CBCBCB"/>
+            </w:tcBorders>
+          </w:tcPr>
+          <w:p>
+            <w:r>
+              <w:rPr>
+                <w:sz w:val="20"/>
+              </w:rPr>
+              <w:t>app-status</w:t>
+            </w:r>
+          </w:p>
+        </w:tc>
+        <w:tc>
+          <w:tcPr>
+            <w:tcW w:type="dxa" w:w="1938"/>
+            <w:tcBorders>
+              <w:top w:val="single" w:sz="4" w:space="0" w:color="CBCBCB"/>
+              <w:left w:val="single" w:sz="4" w:space="0" w:color="CBCBCB"/>
+              <w:bottom w:val="single" w:sz="4" w:space="0" w:color="CBCBCB"/>
+              <w:right w:val="single" w:sz="4" w:space="0" w:color="CBCBCB"/>
+            </w:tcBorders>
+          </w:tcPr>
+          <w:p>
+            <w:r>
+              <w:rPr>
+                <w:sz w:val="20"/>
+              </w:rPr>
+              <w:t>500</w:t>
+            </w:r>
+          </w:p>
+        </w:tc>
+        <w:tc>
+          <w:tcPr>
+            <w:tcW w:type="dxa" w:w="1938"/>
+            <w:tcBorders>
+              <w:top w:val="single" w:sz="4" w:space="0" w:color="CBCBCB"/>
+              <w:left w:val="single" w:sz="4" w:space="0" w:color="CBCBCB"/>
+              <w:bottom w:val="single" w:sz="4" w:space="0" w:color="CBCBCB"/>
+              <w:right w:val="single" w:sz="4" w:space="0" w:color="CBCBCB"/>
+            </w:tcBorders>
+          </w:tcPr>
+          <w:p>
+            <w:r>
+              <w:rPr>
+                <w:sz w:val="20"/>
+              </w:rPr>
+              <w:t>(implicit)</w:t>
+            </w:r>
+          </w:p>
+        </w:tc>
+        <w:tc>
+          <w:tcPr>
+            <w:tcW w:type="dxa" w:w="1938"/>
+            <w:tcBorders>
+              <w:top w:val="single" w:sz="4" w:space="0" w:color="CBCBCB"/>
+              <w:left w:val="single" w:sz="4" w:space="0" w:color="CBCBCB"/>
+              <w:bottom w:val="single" w:sz="4" w:space="0" w:color="CBCBCB"/>
+              <w:right w:val="single" w:sz="4" w:space="0" w:color="CBCBCB"/>
+            </w:tcBorders>
+          </w:tcPr>
+          <w:p>
+            <w:r>
+              <w:rPr>
+                <w:sz w:val="20"/>
+              </w:rPr>
+              <w:t>Unit test (AdbService error path)</w:t>
+            </w:r>
+          </w:p>
+        </w:tc>
+        <w:tc>
+          <w:tcPr>
+            <w:tcW w:type="dxa" w:w="1938"/>
+            <w:tcBorders>
+              <w:top w:val="single" w:sz="4" w:space="0" w:color="CBCBCB"/>
+              <w:left w:val="single" w:sz="4" w:space="0" w:color="CBCBCB"/>
+              <w:bottom w:val="single" w:sz="4" w:space="0" w:color="CBCBCB"/>
+              <w:right w:val="single" w:sz="4" w:space="0" w:color="CBCBCB"/>
+            </w:tcBorders>
+          </w:tcPr>
+          <w:p>
+            <w:r>
+              <w:rPr>
+                <w:sz w:val="20"/>
+              </w:rPr>
+              <w:t>Pass (unit)</w:t>
+            </w:r>
+          </w:p>
+        </w:tc>
+      </w:tr>
+      <w:tr>
+        <w:tc>
+          <w:tcPr>
+            <w:tcW w:type="dxa" w:w="1938"/>
+            <w:shd w:val="clear" w:color="auto" w:fill="B8B3D6"/>
+            <w:tcBorders>
+              <w:top w:val="single" w:sz="4" w:space="0" w:color="CBCBCB"/>
+              <w:left w:val="single" w:sz="4" w:space="0" w:color="CBCBCB"/>
+              <w:bottom w:val="single" w:sz="4" w:space="0" w:color="CBCBCB"/>
+              <w:right w:val="single" w:sz="4" w:space="0" w:color="CBCBCB"/>
+            </w:tcBorders>
+          </w:tcPr>
+          <w:p>
+            <w:r>
+              <w:rPr>
+                <w:sz w:val="20"/>
+              </w:rPr>
+              <w:t>reboot</w:t>
+            </w:r>
+          </w:p>
+        </w:tc>
+        <w:tc>
+          <w:tcPr>
+            <w:tcW w:type="dxa" w:w="1938"/>
+            <w:shd w:val="clear" w:color="auto" w:fill="B8B3D6"/>
+            <w:tcBorders>
+              <w:top w:val="single" w:sz="4" w:space="0" w:color="CBCBCB"/>
+              <w:left w:val="single" w:sz="4" w:space="0" w:color="CBCBCB"/>
+              <w:bottom w:val="single" w:sz="4" w:space="0" w:color="CBCBCB"/>
+              <w:right w:val="single" w:sz="4" w:space="0" w:color="CBCBCB"/>
+            </w:tcBorders>
+          </w:tcPr>
+          <w:p>
+            <w:r>
+              <w:rPr>
+                <w:sz w:val="20"/>
+              </w:rPr>
+              <w:t>200</w:t>
+            </w:r>
+          </w:p>
+        </w:tc>
+        <w:tc>
+          <w:tcPr>
+            <w:tcW w:type="dxa" w:w="1938"/>
+            <w:shd w:val="clear" w:color="auto" w:fill="B8B3D6"/>
+            <w:tcBorders>
+              <w:top w:val="single" w:sz="4" w:space="0" w:color="CBCBCB"/>
+              <w:left w:val="single" w:sz="4" w:space="0" w:color="CBCBCB"/>
+              <w:bottom w:val="single" w:sz="4" w:space="0" w:color="CBCBCB"/>
+              <w:right w:val="single" w:sz="4" w:space="0" w:color="CBCBCB"/>
+            </w:tcBorders>
+          </w:tcPr>
+          <w:p>
+            <w:r>
+              <w:rPr>
+                <w:sz w:val="20"/>
+              </w:rPr>
+              <w:t>TC-B01</w:t>
+            </w:r>
+          </w:p>
+        </w:tc>
+        <w:tc>
+          <w:tcPr>
+            <w:tcW w:type="dxa" w:w="1938"/>
+            <w:shd w:val="clear" w:color="auto" w:fill="B8B3D6"/>
+            <w:tcBorders>
+              <w:top w:val="single" w:sz="4" w:space="0" w:color="CBCBCB"/>
+              <w:left w:val="single" w:sz="4" w:space="0" w:color="CBCBCB"/>
+              <w:bottom w:val="single" w:sz="4" w:space="0" w:color="CBCBCB"/>
+              <w:right w:val="single" w:sz="4" w:space="0" w:color="CBCBCB"/>
+            </w:tcBorders>
+          </w:tcPr>
+          <w:p>
+            <w:r>
+              <w:rPr>
+                <w:sz w:val="20"/>
+              </w:rPr>
+              <w:t>Unit test (không có thiết bị)</w:t>
+            </w:r>
+          </w:p>
+        </w:tc>
+        <w:tc>
+          <w:tcPr>
+            <w:tcW w:type="dxa" w:w="1938"/>
+            <w:shd w:val="clear" w:color="auto" w:fill="B8B3D6"/>
+            <w:tcBorders>
+              <w:top w:val="single" w:sz="4" w:space="0" w:color="CBCBCB"/>
+              <w:left w:val="single" w:sz="4" w:space="0" w:color="CBCBCB"/>
+              <w:bottom w:val="single" w:sz="4" w:space="0" w:color="CBCBCB"/>
+              <w:right w:val="single" w:sz="4" w:space="0" w:color="CBCBCB"/>
+            </w:tcBorders>
+          </w:tcPr>
+          <w:p>
+            <w:r>
+              <w:rPr>
+                <w:sz w:val="20"/>
+              </w:rPr>
+              <w:t>Blocked / Pass (unit)</w:t>
+            </w:r>
+          </w:p>
+        </w:tc>
+      </w:tr>
+      <w:tr>
+        <w:tc>
+          <w:tcPr>
+            <w:tcW w:type="dxa" w:w="1938"/>
+            <w:tcBorders>
+              <w:top w:val="single" w:sz="4" w:space="0" w:color="CBCBCB"/>
+              <w:left w:val="single" w:sz="4" w:space="0" w:color="CBCBCB"/>
+              <w:bottom w:val="single" w:sz="4" w:space="0" w:color="CBCBCB"/>
+              <w:right w:val="single" w:sz="4" w:space="0" w:color="CBCBCB"/>
+            </w:tcBorders>
+          </w:tcPr>
+          <w:p>
+            <w:r>
+              <w:rPr>
+                <w:sz w:val="20"/>
+              </w:rPr>
+              <w:t>reboot</w:t>
+            </w:r>
+          </w:p>
+        </w:tc>
+        <w:tc>
+          <w:tcPr>
+            <w:tcW w:type="dxa" w:w="1938"/>
+            <w:tcBorders>
+              <w:top w:val="single" w:sz="4" w:space="0" w:color="CBCBCB"/>
+              <w:left w:val="single" w:sz="4" w:space="0" w:color="CBCBCB"/>
+              <w:bottom w:val="single" w:sz="4" w:space="0" w:color="CBCBCB"/>
+              <w:right w:val="single" w:sz="4" w:space="0" w:color="CBCBCB"/>
+            </w:tcBorders>
+          </w:tcPr>
+          <w:p>
+            <w:r>
+              <w:rPr>
+                <w:sz w:val="20"/>
+              </w:rPr>
+              <w:t>401</w:t>
+            </w:r>
+          </w:p>
+        </w:tc>
+        <w:tc>
+          <w:tcPr>
+            <w:tcW w:type="dxa" w:w="1938"/>
+            <w:tcBorders>
+              <w:top w:val="single" w:sz="4" w:space="0" w:color="CBCBCB"/>
+              <w:left w:val="single" w:sz="4" w:space="0" w:color="CBCBCB"/>
+              <w:bottom w:val="single" w:sz="4" w:space="0" w:color="CBCBCB"/>
+              <w:right w:val="single" w:sz="4" w:space="0" w:color="CBCBCB"/>
+            </w:tcBorders>
+          </w:tcPr>
+          <w:p>
+            <w:r>
+              <w:rPr>
+                <w:sz w:val="20"/>
+              </w:rPr>
+              <w:t>TC-B03</w:t>
+            </w:r>
+          </w:p>
+        </w:tc>
+        <w:tc>
+          <w:tcPr>
+            <w:tcW w:type="dxa" w:w="1938"/>
+            <w:tcBorders>
+              <w:top w:val="single" w:sz="4" w:space="0" w:color="CBCBCB"/>
+              <w:left w:val="single" w:sz="4" w:space="0" w:color="CBCBCB"/>
+              <w:bottom w:val="single" w:sz="4" w:space="0" w:color="CBCBCB"/>
+              <w:right w:val="single" w:sz="4" w:space="0" w:color="CBCBCB"/>
+            </w:tcBorders>
+          </w:tcPr>
+          <w:p>
+            <w:r>
+              <w:rPr>
+                <w:sz w:val="20"/>
+              </w:rPr>
+              <w:t>HTTP thực tế</w:t>
+            </w:r>
+          </w:p>
+        </w:tc>
+        <w:tc>
+          <w:tcPr>
+            <w:tcW w:type="dxa" w:w="1938"/>
+            <w:tcBorders>
+              <w:top w:val="single" w:sz="4" w:space="0" w:color="CBCBCB"/>
+              <w:left w:val="single" w:sz="4" w:space="0" w:color="CBCBCB"/>
+              <w:bottom w:val="single" w:sz="4" w:space="0" w:color="CBCBCB"/>
+              <w:right w:val="single" w:sz="4" w:space="0" w:color="CBCBCB"/>
+            </w:tcBorders>
+          </w:tcPr>
+          <w:p>
+            <w:r>
+              <w:rPr>
+                <w:sz w:val="20"/>
+              </w:rPr>
+              <w:t>PASS</w:t>
+            </w:r>
+          </w:p>
+        </w:tc>
+      </w:tr>
+      <w:tr>
+        <w:tc>
+          <w:tcPr>
+            <w:tcW w:type="dxa" w:w="1938"/>
+            <w:shd w:val="clear" w:color="auto" w:fill="B8B3D6"/>
+            <w:tcBorders>
+              <w:top w:val="single" w:sz="4" w:space="0" w:color="CBCBCB"/>
+              <w:left w:val="single" w:sz="4" w:space="0" w:color="CBCBCB"/>
+              <w:bottom w:val="single" w:sz="4" w:space="0" w:color="CBCBCB"/>
+              <w:right w:val="single" w:sz="4" w:space="0" w:color="CBCBCB"/>
+            </w:tcBorders>
+          </w:tcPr>
+          <w:p>
+            <w:r>
+              <w:rPr>
+                <w:sz w:val="20"/>
+              </w:rPr>
+              <w:t>reboot</w:t>
+            </w:r>
+          </w:p>
+        </w:tc>
+        <w:tc>
+          <w:tcPr>
+            <w:tcW w:type="dxa" w:w="1938"/>
+            <w:shd w:val="clear" w:color="auto" w:fill="B8B3D6"/>
+            <w:tcBorders>
+              <w:top w:val="single" w:sz="4" w:space="0" w:color="CBCBCB"/>
+              <w:left w:val="single" w:sz="4" w:space="0" w:color="CBCBCB"/>
+              <w:bottom w:val="single" w:sz="4" w:space="0" w:color="CBCBCB"/>
+              <w:right w:val="single" w:sz="4" w:space="0" w:color="CBCBCB"/>
+            </w:tcBorders>
+          </w:tcPr>
+          <w:p>
+            <w:r>
+              <w:rPr>
+                <w:sz w:val="20"/>
+              </w:rPr>
+              <w:t>404</w:t>
+            </w:r>
+          </w:p>
+        </w:tc>
+        <w:tc>
+          <w:tcPr>
+            <w:tcW w:type="dxa" w:w="1938"/>
+            <w:shd w:val="clear" w:color="auto" w:fill="B8B3D6"/>
+            <w:tcBorders>
+              <w:top w:val="single" w:sz="4" w:space="0" w:color="CBCBCB"/>
+              <w:left w:val="single" w:sz="4" w:space="0" w:color="CBCBCB"/>
+              <w:bottom w:val="single" w:sz="4" w:space="0" w:color="CBCBCB"/>
+              <w:right w:val="single" w:sz="4" w:space="0" w:color="CBCBCB"/>
+            </w:tcBorders>
+          </w:tcPr>
+          <w:p>
+            <w:r>
+              <w:rPr>
+                <w:sz w:val="20"/>
+              </w:rPr>
+              <w:t>TC-B02</w:t>
+            </w:r>
+          </w:p>
+        </w:tc>
+        <w:tc>
+          <w:tcPr>
+            <w:tcW w:type="dxa" w:w="1938"/>
+            <w:shd w:val="clear" w:color="auto" w:fill="B8B3D6"/>
+            <w:tcBorders>
+              <w:top w:val="single" w:sz="4" w:space="0" w:color="CBCBCB"/>
+              <w:left w:val="single" w:sz="4" w:space="0" w:color="CBCBCB"/>
+              <w:bottom w:val="single" w:sz="4" w:space="0" w:color="CBCBCB"/>
+              <w:right w:val="single" w:sz="4" w:space="0" w:color="CBCBCB"/>
+            </w:tcBorders>
+          </w:tcPr>
+          <w:p>
+            <w:r>
+              <w:rPr>
+                <w:sz w:val="20"/>
+              </w:rPr>
+              <w:t>HTTP thực tế</w:t>
+            </w:r>
+          </w:p>
+        </w:tc>
+        <w:tc>
+          <w:tcPr>
+            <w:tcW w:type="dxa" w:w="1938"/>
+            <w:shd w:val="clear" w:color="auto" w:fill="B8B3D6"/>
+            <w:tcBorders>
+              <w:top w:val="single" w:sz="4" w:space="0" w:color="CBCBCB"/>
+              <w:left w:val="single" w:sz="4" w:space="0" w:color="CBCBCB"/>
+              <w:bottom w:val="single" w:sz="4" w:space="0" w:color="CBCBCB"/>
+              <w:right w:val="single" w:sz="4" w:space="0" w:color="CBCBCB"/>
+            </w:tcBorders>
+          </w:tcPr>
+          <w:p>
+            <w:r>
+              <w:rPr>
+                <w:sz w:val="20"/>
+              </w:rPr>
+              <w:t>PASS</w:t>
+            </w:r>
+          </w:p>
+        </w:tc>
+      </w:tr>
+      <w:tr>
+        <w:tc>
+          <w:tcPr>
+            <w:tcW w:type="dxa" w:w="1938"/>
+            <w:tcBorders>
+              <w:top w:val="single" w:sz="4" w:space="0" w:color="CBCBCB"/>
+              <w:left w:val="single" w:sz="4" w:space="0" w:color="CBCBCB"/>
+              <w:bottom w:val="single" w:sz="4" w:space="0" w:color="CBCBCB"/>
+              <w:right w:val="single" w:sz="4" w:space="0" w:color="CBCBCB"/>
+            </w:tcBorders>
+          </w:tcPr>
+          <w:p>
+            <w:r>
+              <w:rPr>
+                <w:sz w:val="20"/>
+              </w:rPr>
+              <w:t>reboot</w:t>
+            </w:r>
+          </w:p>
+        </w:tc>
+        <w:tc>
+          <w:tcPr>
+            <w:tcW w:type="dxa" w:w="1938"/>
+            <w:tcBorders>
+              <w:top w:val="single" w:sz="4" w:space="0" w:color="CBCBCB"/>
+              <w:left w:val="single" w:sz="4" w:space="0" w:color="CBCBCB"/>
+              <w:bottom w:val="single" w:sz="4" w:space="0" w:color="CBCBCB"/>
+              <w:right w:val="single" w:sz="4" w:space="0" w:color="CBCBCB"/>
+            </w:tcBorders>
+          </w:tcPr>
+          <w:p>
+            <w:r>
+              <w:rPr>
+                <w:sz w:val="20"/>
+              </w:rPr>
+              <w:t>422</w:t>
+            </w:r>
+          </w:p>
+        </w:tc>
+        <w:tc>
+          <w:tcPr>
+            <w:tcW w:type="dxa" w:w="1938"/>
+            <w:tcBorders>
+              <w:top w:val="single" w:sz="4" w:space="0" w:color="CBCBCB"/>
+              <w:left w:val="single" w:sz="4" w:space="0" w:color="CBCBCB"/>
+              <w:bottom w:val="single" w:sz="4" w:space="0" w:color="CBCBCB"/>
+              <w:right w:val="single" w:sz="4" w:space="0" w:color="CBCBCB"/>
+            </w:tcBorders>
+          </w:tcPr>
+          <w:p>
+            <w:r>
+              <w:rPr>
+                <w:sz w:val="20"/>
+              </w:rPr>
+              <w:t>TC-B04</w:t>
+            </w:r>
+          </w:p>
+        </w:tc>
+        <w:tc>
+          <w:tcPr>
+            <w:tcW w:type="dxa" w:w="1938"/>
+            <w:tcBorders>
+              <w:top w:val="single" w:sz="4" w:space="0" w:color="CBCBCB"/>
+              <w:left w:val="single" w:sz="4" w:space="0" w:color="CBCBCB"/>
+              <w:bottom w:val="single" w:sz="4" w:space="0" w:color="CBCBCB"/>
+              <w:right w:val="single" w:sz="4" w:space="0" w:color="CBCBCB"/>
+            </w:tcBorders>
+          </w:tcPr>
+          <w:p>
+            <w:r>
+              <w:rPr>
+                <w:sz w:val="20"/>
+              </w:rPr>
+              <w:t>Unit test (DeviceOffline + AdbTimeout)</w:t>
+            </w:r>
+          </w:p>
+        </w:tc>
+        <w:tc>
+          <w:tcPr>
+            <w:tcW w:type="dxa" w:w="1938"/>
+            <w:tcBorders>
+              <w:top w:val="single" w:sz="4" w:space="0" w:color="CBCBCB"/>
+              <w:left w:val="single" w:sz="4" w:space="0" w:color="CBCBCB"/>
+              <w:bottom w:val="single" w:sz="4" w:space="0" w:color="CBCBCB"/>
+              <w:right w:val="single" w:sz="4" w:space="0" w:color="CBCBCB"/>
+            </w:tcBorders>
+          </w:tcPr>
+          <w:p>
+            <w:r>
+              <w:rPr>
+                <w:sz w:val="20"/>
+              </w:rPr>
+              <w:t>Pass (unit)</w:t>
+            </w:r>
+          </w:p>
+        </w:tc>
+      </w:tr>
+      <w:tr>
+        <w:tc>
+          <w:tcPr>
+            <w:tcW w:type="dxa" w:w="1938"/>
+            <w:shd w:val="clear" w:color="auto" w:fill="B8B3D6"/>
+            <w:tcBorders>
+              <w:top w:val="single" w:sz="4" w:space="0" w:color="CBCBCB"/>
+              <w:left w:val="single" w:sz="4" w:space="0" w:color="CBCBCB"/>
+              <w:bottom w:val="single" w:sz="4" w:space="0" w:color="CBCBCB"/>
+              <w:right w:val="single" w:sz="4" w:space="0" w:color="CBCBCB"/>
+            </w:tcBorders>
+          </w:tcPr>
+          <w:p>
+            <w:r>
+              <w:rPr>
+                <w:sz w:val="20"/>
+              </w:rPr>
+              <w:t>reboot</w:t>
+            </w:r>
+          </w:p>
+        </w:tc>
+        <w:tc>
+          <w:tcPr>
+            <w:tcW w:type="dxa" w:w="1938"/>
+            <w:shd w:val="clear" w:color="auto" w:fill="B8B3D6"/>
+            <w:tcBorders>
+              <w:top w:val="single" w:sz="4" w:space="0" w:color="CBCBCB"/>
+              <w:left w:val="single" w:sz="4" w:space="0" w:color="CBCBCB"/>
+              <w:bottom w:val="single" w:sz="4" w:space="0" w:color="CBCBCB"/>
+              <w:right w:val="single" w:sz="4" w:space="0" w:color="CBCBCB"/>
+            </w:tcBorders>
+          </w:tcPr>
+          <w:p>
+            <w:r>
+              <w:rPr>
+                <w:sz w:val="20"/>
+              </w:rPr>
+              <w:t>500</w:t>
+            </w:r>
+          </w:p>
+        </w:tc>
+        <w:tc>
+          <w:tcPr>
+            <w:tcW w:type="dxa" w:w="1938"/>
+            <w:shd w:val="clear" w:color="auto" w:fill="B8B3D6"/>
+            <w:tcBorders>
+              <w:top w:val="single" w:sz="4" w:space="0" w:color="CBCBCB"/>
+              <w:left w:val="single" w:sz="4" w:space="0" w:color="CBCBCB"/>
+              <w:bottom w:val="single" w:sz="4" w:space="0" w:color="CBCBCB"/>
+              <w:right w:val="single" w:sz="4" w:space="0" w:color="CBCBCB"/>
+            </w:tcBorders>
+          </w:tcPr>
+          <w:p>
+            <w:r>
+              <w:rPr>
+                <w:sz w:val="20"/>
+              </w:rPr>
+              <w:t>TC-B04</w:t>
+            </w:r>
+          </w:p>
+        </w:tc>
+        <w:tc>
+          <w:tcPr>
+            <w:tcW w:type="dxa" w:w="1938"/>
+            <w:shd w:val="clear" w:color="auto" w:fill="B8B3D6"/>
+            <w:tcBorders>
+              <w:top w:val="single" w:sz="4" w:space="0" w:color="CBCBCB"/>
+              <w:left w:val="single" w:sz="4" w:space="0" w:color="CBCBCB"/>
+              <w:bottom w:val="single" w:sz="4" w:space="0" w:color="CBCBCB"/>
+              <w:right w:val="single" w:sz="4" w:space="0" w:color="CBCBCB"/>
+            </w:tcBorders>
+          </w:tcPr>
+          <w:p>
+            <w:r>
+              <w:rPr>
+                <w:sz w:val="20"/>
+              </w:rPr>
+              <w:t>Unit test (AdbNotFound)</w:t>
+            </w:r>
+          </w:p>
+        </w:tc>
+        <w:tc>
+          <w:tcPr>
+            <w:tcW w:type="dxa" w:w="1938"/>
+            <w:shd w:val="clear" w:color="auto" w:fill="B8B3D6"/>
+            <w:tcBorders>
+              <w:top w:val="single" w:sz="4" w:space="0" w:color="CBCBCB"/>
+              <w:left w:val="single" w:sz="4" w:space="0" w:color="CBCBCB"/>
+              <w:bottom w:val="single" w:sz="4" w:space="0" w:color="CBCBCB"/>
+              <w:right w:val="single" w:sz="4" w:space="0" w:color="CBCBCB"/>
+            </w:tcBorders>
+          </w:tcPr>
+          <w:p>
+            <w:r>
+              <w:rPr>
+                <w:sz w:val="20"/>
+              </w:rPr>
+              <w:t>Pass (unit)</w:t>
+            </w:r>
+          </w:p>
+        </w:tc>
+      </w:tr>
+      <w:tr>
+        <w:tc>
+          <w:tcPr>
+            <w:tcW w:type="dxa" w:w="1938"/>
+            <w:tcBorders>
+              <w:top w:val="single" w:sz="4" w:space="0" w:color="CBCBCB"/>
+              <w:left w:val="single" w:sz="4" w:space="0" w:color="CBCBCB"/>
+              <w:bottom w:val="single" w:sz="4" w:space="0" w:color="CBCBCB"/>
+              <w:right w:val="single" w:sz="4" w:space="0" w:color="CBCBCB"/>
+            </w:tcBorders>
+          </w:tcPr>
+          <w:p>
+            <w:r>
+              <w:rPr>
+                <w:sz w:val="20"/>
+              </w:rPr>
+              <w:t>UI</w:t>
+            </w:r>
+          </w:p>
+        </w:tc>
+        <w:tc>
+          <w:tcPr>
+            <w:tcW w:type="dxa" w:w="1938"/>
+            <w:tcBorders>
+              <w:top w:val="single" w:sz="4" w:space="0" w:color="CBCBCB"/>
+              <w:left w:val="single" w:sz="4" w:space="0" w:color="CBCBCB"/>
+              <w:bottom w:val="single" w:sz="4" w:space="0" w:color="CBCBCB"/>
+              <w:right w:val="single" w:sz="4" w:space="0" w:color="CBCBCB"/>
+            </w:tcBorders>
+          </w:tcPr>
+          <w:p>
+            <w:r>
+              <w:rPr>
+                <w:sz w:val="20"/>
+              </w:rPr>
+              <w:t>3 smoke TC</w:t>
+            </w:r>
+          </w:p>
+        </w:tc>
+        <w:tc>
+          <w:tcPr>
+            <w:tcW w:type="dxa" w:w="1938"/>
+            <w:tcBorders>
+              <w:top w:val="single" w:sz="4" w:space="0" w:color="CBCBCB"/>
+              <w:left w:val="single" w:sz="4" w:space="0" w:color="CBCBCB"/>
+              <w:bottom w:val="single" w:sz="4" w:space="0" w:color="CBCBCB"/>
+              <w:right w:val="single" w:sz="4" w:space="0" w:color="CBCBCB"/>
+            </w:tcBorders>
+          </w:tcPr>
+          <w:p>
+            <w:r>
+              <w:rPr>
+                <w:sz w:val="20"/>
+              </w:rPr>
+              <w:t>TC-C01/C02/C03</w:t>
+            </w:r>
+          </w:p>
+        </w:tc>
+        <w:tc>
+          <w:tcPr>
+            <w:tcW w:type="dxa" w:w="1938"/>
+            <w:tcBorders>
+              <w:top w:val="single" w:sz="4" w:space="0" w:color="CBCBCB"/>
+              <w:left w:val="single" w:sz="4" w:space="0" w:color="CBCBCB"/>
+              <w:bottom w:val="single" w:sz="4" w:space="0" w:color="CBCBCB"/>
+              <w:right w:val="single" w:sz="4" w:space="0" w:color="CBCBCB"/>
+            </w:tcBorders>
+          </w:tcPr>
+          <w:p>
+            <w:r>
+              <w:rPr>
+                <w:sz w:val="20"/>
+              </w:rPr>
+              <w:t>Playwright (UXR STEP-3.3)</w:t>
+            </w:r>
+          </w:p>
+        </w:tc>
+        <w:tc>
+          <w:tcPr>
+            <w:tcW w:type="dxa" w:w="1938"/>
+            <w:tcBorders>
+              <w:top w:val="single" w:sz="4" w:space="0" w:color="CBCBCB"/>
+              <w:left w:val="single" w:sz="4" w:space="0" w:color="CBCBCB"/>
+              <w:bottom w:val="single" w:sz="4" w:space="0" w:color="CBCBCB"/>
+              <w:right w:val="single" w:sz="4" w:space="0" w:color="CBCBCB"/>
+            </w:tcBorders>
+          </w:tcPr>
+          <w:p>
+            <w:r>
+              <w:rPr>
+                <w:sz w:val="20"/>
+              </w:rPr>
+              <w:t>PASS</w:t>
+            </w:r>
+          </w:p>
+        </w:tc>
+      </w:tr>
+    </w:tbl>
+    <w:p/>
+    <w:p>
+      <w:pPr>
+        <w:spacing w:after="80"/>
+      </w:pPr>
+      <w:r>
+        <w:rPr>
+          <w:sz w:val="21"/>
+        </w:rPr>
+        <w:t>Tất cả status code trong TDD §3.1 và §3.2 đều có TC tương ứng. 7/14 TC pass qua HTTP thực tế với bằng chứng curl log đầy đủ. 3/14 pass qua Playwright (UXR). 4/14 pass qua unit test.</w:t>
+      </w:r>
+    </w:p>
+    <w:p>
+      <w:pPr>
+        <w:pStyle w:val="Heading3"/>
+        <w:spacing w:before="160" w:after="60"/>
+      </w:pPr>
+      <w:r>
+        <w:rPr>
+          <w:color w:val="4A3F8C"/>
+          <w:sz w:val="24"/>
+        </w:rPr>
+        <w:t>Đánh giá đặc biệt — TC-B01 (reboot destructive)</w:t>
+      </w:r>
+    </w:p>
+    <w:p>
+      <w:pPr>
+        <w:spacing w:after="80"/>
+      </w:pPr>
+      <w:r>
+        <w:rPr>
+          <w:sz w:val="21"/>
+        </w:rPr>
+        <w:t>TC-B01 là lệnh destructive (</w:t>
+      </w:r>
+      <w:r>
+        <w:rPr>
+          <w:rFonts w:ascii="Courier New" w:hAnsi="Courier New"/>
+          <w:color w:val="F05922"/>
+          <w:sz w:val="18"/>
+        </w:rPr>
+        <w:t>adb reboot</w:t>
+      </w:r>
+      <w:r>
+        <w:rPr>
+          <w:sz w:val="21"/>
+        </w:rPr>
+        <w:t>) — sau khi gửi lệnh, thiết bị offline ngay, không hoàn tác được. Đây là rủi ro cần lưu ý:</w:t>
+      </w:r>
+    </w:p>
+    <w:p>
+      <w:pPr>
+        <w:pStyle w:val="ListBullet"/>
+        <w:spacing w:after="20"/>
+        <w:ind w:left="283"/>
+      </w:pPr>
+      <w:r>
+        <w:rPr>
+          <w:sz w:val="21"/>
+        </w:rPr>
+        <w:t>Logic endpoint và AdbService đã được xác nhận qua unit test (mock ADB process)</w:t>
+      </w:r>
+    </w:p>
+    <w:p>
+      <w:pPr>
+        <w:pStyle w:val="ListBullet"/>
+        <w:spacing w:after="20"/>
+        <w:ind w:left="283"/>
+      </w:pPr>
+      <w:r>
+        <w:rPr>
+          <w:sz w:val="21"/>
+        </w:rPr>
+        <w:t>Confirm dialog UI đã được Playwright xác nhận (TC-C02 — user phải bấm OK mới gửi lệnh)</w:t>
+      </w:r>
+    </w:p>
+    <w:p>
+      <w:pPr>
+        <w:pStyle w:val="ListBullet"/>
+        <w:spacing w:after="20"/>
+        <w:ind w:left="283"/>
+      </w:pPr>
+      <w:r>
+        <w:rPr>
+          <w:sz w:val="21"/>
+        </w:rPr>
+        <w:t xml:space="preserve">Tuy nhiên, luồng E2E thực tế (gọi HTTP → ADB → thiết bị reboot → response "RebootInitiated") </w:t>
+      </w:r>
+      <w:r>
+        <w:rPr>
+          <w:b/>
+          <w:sz w:val="21"/>
+        </w:rPr>
+        <w:t>chưa được verify bằng thiết bị thật</w:t>
+      </w:r>
+    </w:p>
+    <w:p>
+      <w:pPr>
+        <w:spacing w:after="80"/>
+      </w:pPr>
+      <w:r>
+        <w:rPr>
+          <w:sz w:val="21"/>
+        </w:rPr>
+        <w:t>Đây không phải P0/P1 bug — đây là gap coverage do môi trường test không có thiết bị Android, không phải do code sai. Unit test đã confirm đúng contract.</w:t>
+      </w:r>
+    </w:p>
+    <w:p>
+      <w:pPr>
+        <w:pStyle w:val="Heading3"/>
+        <w:spacing w:before="160" w:after="60"/>
+      </w:pPr>
+      <w:r>
+        <w:rPr>
+          <w:color w:val="4A3F8C"/>
+          <w:sz w:val="24"/>
+        </w:rPr>
+        <w:t>Trạng thái bug</w:t>
+      </w:r>
+    </w:p>
+    <w:p>
+      <w:pPr>
+        <w:pStyle w:val="ListBullet"/>
+        <w:spacing w:after="20"/>
+        <w:ind w:left="283"/>
+      </w:pPr>
+      <w:r>
+        <w:rPr>
+          <w:sz w:val="21"/>
+        </w:rPr>
+        <w:t xml:space="preserve">P0 open: </w:t>
+      </w:r>
+      <w:r>
+        <w:rPr>
+          <w:b/>
+          <w:sz w:val="21"/>
+        </w:rPr>
+        <w:t>0</w:t>
+      </w:r>
+    </w:p>
+    <w:p>
+      <w:pPr>
+        <w:pStyle w:val="ListBullet"/>
+        <w:spacing w:after="20"/>
+        <w:ind w:left="283"/>
+      </w:pPr>
+      <w:r>
+        <w:rPr>
+          <w:sz w:val="21"/>
+        </w:rPr>
+        <w:t xml:space="preserve">P1 open: </w:t>
+      </w:r>
+      <w:r>
+        <w:rPr>
+          <w:b/>
+          <w:sz w:val="21"/>
+        </w:rPr>
+        <w:t>0</w:t>
+      </w:r>
+    </w:p>
+    <w:p>
+      <w:pPr>
+        <w:pStyle w:val="ListBullet"/>
+        <w:spacing w:after="20"/>
+        <w:ind w:left="283"/>
+      </w:pPr>
+      <w:r>
+        <w:rPr>
+          <w:sz w:val="21"/>
+        </w:rPr>
+        <w:t xml:space="preserve">Tổng bug phát hiện: </w:t>
+      </w:r>
+      <w:r>
+        <w:rPr>
+          <w:b/>
+          <w:sz w:val="21"/>
+        </w:rPr>
+        <w:t>0</w:t>
+      </w:r>
+    </w:p>
+    <w:p>
+      <w:pPr>
+        <w:spacing w:after="80"/>
+      </w:pPr>
+      <w:r>
+        <w:rPr>
+          <w:sz w:val="21"/>
+        </w:rPr>
+        <w:t xml:space="preserve">Điều kiện VETO (còn P0/P1 bug) </w:t>
+      </w:r>
+      <w:r>
+        <w:rPr>
+          <w:b/>
+          <w:sz w:val="21"/>
+        </w:rPr>
+        <w:t>không áp dụng</w:t>
+      </w:r>
+      <w:r>
+        <w:rPr>
+          <w:sz w:val="21"/>
+        </w:rPr>
+        <w:t>.</w:t>
+      </w:r>
+    </w:p>
+    <w:p>
+      <w:pPr>
+        <w:pStyle w:val="Heading3"/>
+        <w:spacing w:before="160" w:after="60"/>
+      </w:pPr>
+      <w:r>
+        <w:rPr>
+          <w:color w:val="4A3F8C"/>
+          <w:sz w:val="24"/>
+        </w:rPr>
+        <w:t>Quyết định: APPROVED CÓ ĐIỀU KIỆN</w:t>
+      </w:r>
+    </w:p>
+    <w:p>
+      <w:pPr>
+        <w:spacing w:after="80"/>
+      </w:pPr>
+      <w:r>
+        <w:rPr>
+          <w:b/>
+          <w:sz w:val="21"/>
+        </w:rPr>
+        <w:t>SIGN-OFF: APPROVED CÓ ĐIỀU KIỆN</w:t>
+      </w:r>
+    </w:p>
+    <w:p>
+      <w:pPr>
+        <w:spacing w:after="80"/>
+      </w:pPr>
+      <w:r>
+        <w:rPr>
+          <w:sz w:val="21"/>
+        </w:rPr>
+        <w:t xml:space="preserve">Feature đủ điều kiện deploy nội bộ (staging/internal). Trước khi go-live production, DevOps Engineer PHẢI thực hiện </w:t>
+      </w:r>
+      <w:r>
+        <w:rPr>
+          <w:b/>
+          <w:sz w:val="21"/>
+        </w:rPr>
+        <w:t>và ghi nhận bằng chứng</w:t>
+      </w:r>
+      <w:r>
+        <w:rPr>
+          <w:sz w:val="21"/>
+        </w:rPr>
+        <w:t xml:space="preserve"> hai điều kiện bắt buộc sau:</w:t>
+      </w:r>
+    </w:p>
+    <w:p>
+      <w:pPr>
+        <w:spacing w:after="80"/>
+      </w:pPr>
+      <w:r>
+        <w:rPr>
+          <w:b/>
+          <w:sz w:val="21"/>
+        </w:rPr>
+        <w:t>Điều kiện 1 — Smoke test app-status với thiết bị thật:</w:t>
+      </w:r>
+    </w:p>
+    <w:p>
+      <w:pPr>
+        <w:pStyle w:val="ListBullet"/>
+        <w:spacing w:after="20"/>
+        <w:ind w:left="283"/>
+      </w:pPr>
+      <w:r>
+        <w:rPr>
+          <w:sz w:val="21"/>
+        </w:rPr>
+        <w:t>Chạy TC-A01 với thiết bị Android thật có app đang ở foreground</w:t>
+      </w:r>
+    </w:p>
+    <w:p>
+      <w:pPr>
+        <w:pStyle w:val="ListBullet"/>
+        <w:spacing w:after="20"/>
+        <w:ind w:left="283"/>
+      </w:pPr>
+      <w:r>
+        <w:rPr>
+          <w:sz w:val="21"/>
+        </w:rPr>
+        <w:t xml:space="preserve">Xác nhận HTTP 200, </w:t>
+      </w:r>
+      <w:r>
+        <w:rPr>
+          <w:rFonts w:ascii="Courier New" w:hAnsi="Courier New"/>
+          <w:color w:val="F05922"/>
+          <w:sz w:val="21"/>
+        </w:rPr>
+        <w:t>state: "Foreground"</w:t>
+      </w:r>
+      <w:r>
+        <w:rPr>
+          <w:sz w:val="21"/>
+        </w:rPr>
+        <w:t xml:space="preserve"> trả về đúng</w:t>
+      </w:r>
+    </w:p>
+    <w:p>
+      <w:pPr>
+        <w:pStyle w:val="ListBullet"/>
+        <w:spacing w:after="20"/>
+        <w:ind w:left="283"/>
+      </w:pPr>
+      <w:r>
+        <w:rPr>
+          <w:sz w:val="21"/>
+        </w:rPr>
+        <w:t>Ghi curl output + screenshot/log vào DEPLOY doc</w:t>
+      </w:r>
+    </w:p>
+    <w:p>
+      <w:pPr>
+        <w:spacing w:after="80"/>
+      </w:pPr>
+      <w:r>
+        <w:rPr>
+          <w:b/>
+          <w:sz w:val="21"/>
+        </w:rPr>
+        <w:t>Điều kiện 2 — Smoke test reboot với thiết bị thật:</w:t>
+      </w:r>
+    </w:p>
+    <w:p>
+      <w:pPr>
+        <w:pStyle w:val="ListBullet"/>
+        <w:spacing w:after="20"/>
+        <w:ind w:left="283"/>
+      </w:pPr>
+      <w:r>
+        <w:rPr>
+          <w:sz w:val="21"/>
+        </w:rPr>
+        <w:t>Chạy TC-B01 với thiết bị Android thật trong môi trường staging (KHÔNG dùng thiết bị production đang phục vụ người dùng)</w:t>
+      </w:r>
+    </w:p>
+    <w:p>
+      <w:pPr>
+        <w:pStyle w:val="ListBullet"/>
+        <w:spacing w:after="20"/>
+        <w:ind w:left="283"/>
+      </w:pPr>
+      <w:r>
+        <w:rPr>
+          <w:sz w:val="21"/>
+        </w:rPr>
+        <w:t xml:space="preserve">Xác nhận HTTP 200, </w:t>
+      </w:r>
+      <w:r>
+        <w:rPr>
+          <w:rFonts w:ascii="Courier New" w:hAnsi="Courier New"/>
+          <w:color w:val="F05922"/>
+          <w:sz w:val="21"/>
+        </w:rPr>
+        <w:t>status: "RebootInitiated"</w:t>
+      </w:r>
+      <w:r>
+        <w:rPr>
+          <w:sz w:val="21"/>
+        </w:rPr>
+        <w:t xml:space="preserve"> trả về trước khi thiết bị offline</w:t>
+      </w:r>
+    </w:p>
+    <w:p>
+      <w:pPr>
+        <w:pStyle w:val="ListBullet"/>
+        <w:spacing w:after="20"/>
+        <w:ind w:left="283"/>
+      </w:pPr>
+      <w:r>
+        <w:rPr>
+          <w:sz w:val="21"/>
+        </w:rPr>
+        <w:t>Ghi curl output vào DEPLOY doc</w:t>
+      </w:r>
+    </w:p>
+    <w:p>
+      <w:pPr>
+        <w:pStyle w:val="ListBullet"/>
+        <w:spacing w:after="20"/>
+        <w:ind w:left="283"/>
+      </w:pPr>
+      <w:r>
+        <w:rPr>
+          <w:sz w:val="21"/>
+        </w:rPr>
+        <w:t>Xác nhận thiết bị reconnect sau reboot (smoke test bổ sung)</w:t>
+      </w:r>
+    </w:p>
+    <w:p>
+      <w:pPr>
+        <w:spacing w:after="80"/>
+      </w:pPr>
+      <w:r>
+        <w:rPr>
+          <w:b/>
+          <w:sz w:val="21"/>
+        </w:rPr>
+        <w:t>Nếu cả 2 điều kiện đều pass:</w:t>
+      </w:r>
+      <w:r>
+        <w:rPr>
+          <w:sz w:val="21"/>
+        </w:rPr>
+        <w:t xml:space="preserve"> Feature được phép deploy production không cần thêm sign-off.</w:t>
+      </w:r>
+    </w:p>
+    <w:p>
+      <w:pPr>
+        <w:spacing w:after="80"/>
+      </w:pPr>
+      <w:r>
+        <w:rPr>
+          <w:b/>
+          <w:sz w:val="21"/>
+        </w:rPr>
+        <w:t>Nếu một trong 2 điều kiện fail:</w:t>
+      </w:r>
+      <w:r>
+        <w:rPr>
+          <w:sz w:val="21"/>
+        </w:rPr>
+        <w:t xml:space="preserve"> DevOps Lead phải escalate lên QA Lead để re-evaluate trước khi tiếp tục.</w:t>
+      </w:r>
+    </w:p>
+    <w:p>
+      <w:pPr>
+        <w:spacing w:after="80"/>
+      </w:pPr>
+      <w:r>
+        <w:rPr>
+          <w:sz w:val="21"/>
+        </w:rPr>
+        <w:t xml:space="preserve">Deploy nội bộ (staging image Docker, nhánh </w:t>
+      </w:r>
+      <w:r>
+        <w:rPr>
+          <w:rFonts w:ascii="Courier New" w:hAnsi="Courier New"/>
+          <w:color w:val="F05922"/>
+          <w:sz w:val="18"/>
+        </w:rPr>
+        <w:t>docker-deploy</w:t>
+      </w:r>
+      <w:r>
+        <w:rPr>
+          <w:sz w:val="21"/>
+        </w:rPr>
+        <w:t xml:space="preserve">): </w:t>
+      </w:r>
+      <w:r>
+        <w:rPr>
+          <w:b/>
+          <w:sz w:val="21"/>
+        </w:rPr>
+        <w:t>KHÔNG BỊ BLOCK</w:t>
+      </w:r>
+      <w:r>
+        <w:rPr>
+          <w:sz w:val="21"/>
+        </w:rPr>
+        <w:t xml:space="preserve"> bởi 2 TC Blocked — có thể tiến hành song song với việc thu xếp thiết bị thật để test.</w:t>
+      </w:r>
+    </w:p>
     <w:sectPr>
       <w:headerReference w:type="default" r:id="rId9"/>
       <w:footerReference w:type="default" r:id="rId10"/>

</xml_diff>